<commit_message>
Proposal docx: add preliminary findings and figures; reproducible build script
Co-Authored-By: Claude Fable 5 <noreply@anthropic.com>
Claude-Session: https://claude.ai/code/session_018XAsB6afLZTP8oRZGAaovd
</commit_message>
<xml_diff>
--- a/FoamGPT_Research_Proposal.docx
+++ b/FoamGPT_Research_Proposal.docx
@@ -61,7 +61,7 @@
           <w:b w:val="0"/>
           <w:i/>
         </w:rPr>
-        <w:t>August 2026  ·  Code: github.com/Harshelite2503/foamgpt (private)</w:t>
+        <w:t>August 2026  ·  Code: github.com/Harshelite2503/foamgpt</w:t>
       </w:r>
     </w:p>
     <w:p>
@@ -78,7 +78,7 @@
           <w:b w:val="0"/>
           <w:i w:val="0"/>
         </w:rPr>
-        <w:t>Syntactic foams—composites of hollow glass, ceramic, or polymer microspheres in a polymer or metal matrix—have been studied for over three decades and underpin deep-sea buoyancy modules, aerospace and marine sandwich cores, and energy-absorbing structures. Approximately 1,300 research papers report quantitative processing–structure–property (PSP) results for these materials, yet no consolidated, machine-readable dataset exists: the numbers remain locked in PDF tables and figures. As a consequence, materials selection is done by manual literature review, machine-learning models are trained on a few dozen in-house samples, and the reliability of large language models (LLMs) for composite property questions is untested. We propose FoamGPT: (i) an LLM-driven extraction pipeline that converts the syntactic-foam literature into an open, auditable PSP dataset in which every value is linked to a verbatim source quote; (ii) expert validation of the dataset by the collaborating group; and (iii) a benchmark comparing classical machine learning and frontier LLMs on property prediction, including an analysis of LLM hallucination and calibration. A working pipeline has been built and verified on a pilot: 37 records extracted from 3 papers at ~US$1 with zero unit or range errors. The full pilot corpus (93 open-access papers) can be processed for approximately US$30. Outcomes are a dataset-descriptor paper and a benchmark paper, plus a data asset that enables inverse design and extension to additively manufactured composites.</w:t>
+        <w:t>Syntactic foams—composites of hollow glass, ceramic, or polymer microspheres in a polymer or metal matrix—have been studied for over three decades and underpin deep-sea buoyancy modules, aerospace and marine sandwich cores, and energy-absorbing structures. We identify 1,329 research papers (1990–2026) reporting quantitative processing–structure–property (PSP) results for these materials, yet no consolidated, machine-readable dataset exists: the numbers remain locked in PDF tables and figures. As a consequence, materials selection is done by manual literature review, machine-learning models are trained on a few dozen in-house samples, and the reliability of large language models (LLMs) for composite property questions is untested. We propose FoamGPT: (i) an LLM-driven extraction pipeline that converts the syntactic-foam literature into an open, auditable PSP dataset in which every value is linked to a verbatim source quote; (ii) expert validation of the dataset by the collaborating group; and (iii) a benchmark comparing classical machine learning and frontier LLMs on property prediction, including an analysis of LLM hallucination and calibration. A working pipeline has been built and verified on a pilot: 37 records extracted from 3 papers at ≈US$1.01 with zero unit or range errors, reproducing the known density–strength relationship of aluminium syntactic foams (r = 0.97). The full open-access pilot corpus (93 papers) can be processed for approximately US$30. Outcomes are a dataset-descriptor paper and a benchmark paper, plus a data asset that enables inverse design and extension to additively manufactured composites.</w:t>
       </w:r>
     </w:p>
     <w:p>
@@ -103,7 +103,7 @@
           <w:b w:val="0"/>
           <w:i w:val="0"/>
         </w:rPr>
-        <w:t>Every syntactic-foam paper reports the same class of result: a particle type and grade, a volume fraction, a matrix, a processing route, the resulting density, and measured mechanical properties. Across ~1,300 papers this constitutes the most complete experimental record of any hollow-particle composite. It is, however, entirely unstructured. Tables use inconsistent units (MPa vs. GPa, g/cm³ vs. kg/m³, vol% vs. wt%), sample labels are paper-specific, and many values appear only in figures.</w:t>
+        <w:t>Every syntactic-foam paper reports the same class of result: a particle type and grade, a volume fraction, a matrix, a processing route, the resulting density, and measured mechanical properties. Across more than a thousand papers this constitutes the most complete experimental record of any hollow-particle composite. It is, however, entirely unstructured. Tables use inconsistent units (MPa vs. GPa, g/cm³ vs. kg/m³, vol% vs. wt%), sample labels are paper-specific, and many values appear only in figures.</w:t>
       </w:r>
     </w:p>
     <w:p>
@@ -520,7 +520,7 @@
           <w:b w:val="0"/>
           <w:i w:val="0"/>
         </w:rPr>
-        <w:t>One record = one composition × one test condition. Fields are grouped as Processing (matrix class/name, particle type/grade, true density, diameter, wall-thickness ratio η, volume/weight fraction, process route, cure temperature, additional fillers), Structure (measured and theoretical density, matrix porosity, particle breakage), Test (type, strain rate, temperature, standard), and Properties (modulus, strength, failure strain, energy absorption, plateau stress, densification strain, DMA, thermal, moisture). Every numeric field is optional—missing is allowed, hallucination is not. Each record carries ≥1 verbatim evidence quote and an extractor confidence score.</w:t>
+        <w:t>One record = one composition × one test condition. Fields are grouped as Processing (matrix class/name, particle type/grade, true density, diameter, wall-thickness ratio η, volume/weight fraction, process route, cure temperature, additional fillers), Structure (measured and theoretical density, matrix porosity, particle breakage), Test (type, strain rate, temperature, standard), and Properties (modulus, strength, failure strain, energy absorption, plateau stress, densification strain, DMA, thermal, moisture). Every numeric field is optional—missing is allowed, hallucination is not. Each record carries ≥1 verbatim evidence quote, a primary/secondary/model data-origin tag, and an extractor confidence score.</w:t>
       </w:r>
     </w:p>
     <w:p>
@@ -604,12 +604,88 @@
       </w:r>
     </w:p>
     <w:p>
+      <w:pPr>
+        <w:pStyle w:val="Heading2"/>
+      </w:pPr>
+      <w:r>
+        <w:t>5.1 The corpus is large, growing, and concentrated in top materials journals</w:t>
+      </w:r>
+    </w:p>
+    <w:p>
       <w:r>
         <w:rPr>
           <w:b w:val="0"/>
           <w:i w:val="0"/>
         </w:rPr>
-        <w:t>The complete pipeline has been implemented, unit-tested, and exercised end-to-end. A synchronous extraction run on the three most-cited open-access papers produced the following:</w:t>
+        <w:t>OpenAlex retrieval and relevance filtering yield 1,329 strongly relevant papers spanning 1990–2026 with 31,204 total citations. Output has roughly doubled each decade (44 papers in the 1990s, 247 in the 2000s, 599 in the 2010s, 439 so far in the 2020s), confirming an active field. The leading venues are Materials Science and Engineering A (55), Composites Part B Engineering (38), Materials (34), Journal of Applied Polymer Science (32), Journal of Materials Science (31). Only 21% of relevant papers have an open-access PDF, which quantifies the value of institutional access in Phase 2.</w:t>
+      </w:r>
+    </w:p>
+    <w:p>
+      <w:pPr>
+        <w:jc w:val="center"/>
+      </w:pPr>
+      <w:r>
+        <w:drawing>
+          <wp:inline xmlns:a="http://schemas.openxmlformats.org/drawingml/2006/main" xmlns:pic="http://schemas.openxmlformats.org/drawingml/2006/picture">
+            <wp:extent cx="5303520" cy="2651760"/>
+            <wp:docPr id="1" name="Picture 1"/>
+            <wp:cNvGraphicFramePr>
+              <a:graphicFrameLocks noChangeAspect="1"/>
+            </wp:cNvGraphicFramePr>
+            <a:graphic>
+              <a:graphicData uri="http://schemas.openxmlformats.org/drawingml/2006/picture">
+                <pic:pic>
+                  <pic:nvPicPr>
+                    <pic:cNvPr id="0" name="corpus_by_year.png"/>
+                    <pic:cNvPicPr/>
+                  </pic:nvPicPr>
+                  <pic:blipFill>
+                    <a:blip r:embed="rId9"/>
+                    <a:stretch>
+                      <a:fillRect/>
+                    </a:stretch>
+                  </pic:blipFill>
+                  <pic:spPr>
+                    <a:xfrm>
+                      <a:off x="0" y="0"/>
+                      <a:ext cx="5303520" cy="2651760"/>
+                    </a:xfrm>
+                    <a:prstGeom prst="rect"/>
+                  </pic:spPr>
+                </pic:pic>
+              </a:graphicData>
+            </a:graphic>
+          </wp:inline>
+        </w:drawing>
+      </w:r>
+    </w:p>
+    <w:p>
+      <w:pPr>
+        <w:jc w:val="center"/>
+      </w:pPr>
+      <w:r>
+        <w:rPr>
+          <w:b w:val="0"/>
+          <w:i/>
+        </w:rPr>
+        <w:t>Figure 1. Strongly relevant syntactic-foam papers per year in the FoamGPT corpus.</w:t>
+      </w:r>
+    </w:p>
+    <w:p>
+      <w:pPr>
+        <w:pStyle w:val="Heading2"/>
+      </w:pPr>
+      <w:r>
+        <w:t>5.2 The extraction pipeline works on real papers at low cost</w:t>
+      </w:r>
+    </w:p>
+    <w:p>
+      <w:r>
+        <w:rPr>
+          <w:b w:val="0"/>
+          <w:i w:val="0"/>
+        </w:rPr>
+        <w:t>A synchronous run on the three most-cited open-access papers produced 37 validated records for 97,488 input / 20,836 output tokens (≈US$1.01). Automated curation raised zero range or unit flags. Every record carries a verbatim evidence quote; spot checks confirm that values were read from the correct table rows and that unit conversions (kg/m³→g/cm³, GPa→MPa, vol%→fraction) were applied correctly.</w:t>
       </w:r>
     </w:p>
     <w:tbl>
@@ -695,7 +771,7 @@
           </w:tcPr>
           <w:p>
             <w:r>
-              <w:t>Al7075 + ceramic hollow microspheres, Vf = 0.66; e.g. ρ = 2.388 g/cm³, E = 3,220 MPa, σ = 179 MPa — all traced to Table 3 with correct kg/m³→g/cm³ and GPa→MPa conversion</w:t>
+              <w:t>Al7075 + ceramic hollow microspheres, Vf = 0.66; six quasi-static compositions (ρ 1.585–2.388 g/cm³, σ 75–181 MPa) and six SHPB tests (882–1578 s⁻¹, σ 203–601 MPa) — all traced to Tables 3–4</w:t>
             </w:r>
           </w:p>
         </w:tc>
@@ -727,7 +803,7 @@
           </w:tcPr>
           <w:p>
             <w:r>
-              <w:t>Sylgard 184 PDMS + 3M A16-500 microballoons, 10–46 vol%</w:t>
+              <w:t>Sylgard 184 PDMS + 3M A16-500 microballoons, 10–46 vol%, from Table 1</w:t>
             </w:r>
           </w:p>
         </w:tc>
@@ -759,7 +835,7 @@
           </w:tcPr>
           <w:p>
             <w:r>
-              <w:t>Literature values from the review’s Table 4 (e.g., A356/SiC, 181 MPa, Gupta et al.) — motivated the addition of a primary/secondary data-origin field to prevent double counting</w:t>
+              <w:t>Literature values from the review’s Table 4 (e.g., A356/SiC, 181 MPa, Gupta et al.) — motivated the primary/secondary data-origin field to prevent double counting</w:t>
             </w:r>
           </w:p>
         </w:tc>
@@ -768,10 +844,95 @@
     <w:p/>
     <w:p>
       <w:pPr>
-        <w:pStyle w:val="ListBullet"/>
+        <w:pStyle w:val="Heading2"/>
       </w:pPr>
       <w:r>
-        <w:t>37 records, 0 range/unit flags from automated curation.</w:t>
+        <w:t>5.3 Extracted data reproduce known physics</w:t>
+      </w:r>
+    </w:p>
+    <w:p>
+      <w:r>
+        <w:rPr>
+          <w:b w:val="0"/>
+          <w:i w:val="0"/>
+        </w:rPr>
+        <w:t>Even at pilot scale the dataset recovers established structure–property relationships. Across the 6 quasi-static aluminium-foam compositions, compressive strength rises monotonically with density (Pearson r = 0.97; 75 MPa at 1.585 g/cm³ to 181 MPa at 2.388 g/cm³), and specific strength spans 47–100 MPa·cm³/g. The same paper’s split-Hopkinson bar series shows the expected strong strain-rate sensitivity of Al7075-matrix foams, with peak stresses 2–3× the quasi-static values at ~10³ s⁻¹. These trends appear directly in the extracted table without any manual post-processing, which is the behaviour the full-scale benchmark relies on.</w:t>
+      </w:r>
+    </w:p>
+    <w:p>
+      <w:pPr>
+        <w:jc w:val="center"/>
+      </w:pPr>
+      <w:r>
+        <w:drawing>
+          <wp:inline xmlns:a="http://schemas.openxmlformats.org/drawingml/2006/main" xmlns:pic="http://schemas.openxmlformats.org/drawingml/2006/picture">
+            <wp:extent cx="5303520" cy="3182112"/>
+            <wp:docPr id="2" name="Picture 2"/>
+            <wp:cNvGraphicFramePr>
+              <a:graphicFrameLocks noChangeAspect="1"/>
+            </wp:cNvGraphicFramePr>
+            <a:graphic>
+              <a:graphicData uri="http://schemas.openxmlformats.org/drawingml/2006/picture">
+                <pic:pic>
+                  <pic:nvPicPr>
+                    <pic:cNvPr id="0" name="pilot_density_strength.png"/>
+                    <pic:cNvPicPr/>
+                  </pic:nvPicPr>
+                  <pic:blipFill>
+                    <a:blip r:embed="rId10"/>
+                    <a:stretch>
+                      <a:fillRect/>
+                    </a:stretch>
+                  </pic:blipFill>
+                  <pic:spPr>
+                    <a:xfrm>
+                      <a:off x="0" y="0"/>
+                      <a:ext cx="5303520" cy="3182112"/>
+                    </a:xfrm>
+                    <a:prstGeom prst="rect"/>
+                  </pic:spPr>
+                </pic:pic>
+              </a:graphicData>
+            </a:graphic>
+          </wp:inline>
+        </w:drawing>
+      </w:r>
+    </w:p>
+    <w:p>
+      <w:pPr>
+        <w:jc w:val="center"/>
+      </w:pPr>
+      <w:r>
+        <w:rPr>
+          <w:b w:val="0"/>
+          <w:i/>
+        </w:rPr>
+        <w:t>Figure 2. Density versus compressive strength for the pilot records, coloured by matrix class.</w:t>
+      </w:r>
+    </w:p>
+    <w:p>
+      <w:pPr>
+        <w:pStyle w:val="Heading2"/>
+      </w:pPr>
+      <w:r>
+        <w:t>5.4 Field coverage and what it tells us</w:t>
+      </w:r>
+    </w:p>
+    <w:p>
+      <w:r>
+        <w:rPr>
+          <w:b w:val="0"/>
+          <w:i w:val="0"/>
+        </w:rPr>
+        <w:t>Coverage across the 37 pilot records is 84% for strength, 32% for modulus, 22% for measured density, 38% for volume fraction and 46% for strain rate. Gaps are genuine (values not stated in tables) rather than extraction failures—the model left fields null instead of guessing, as instructed. This supports the design decision to score the dataset by provenance and completeness rather than force-fill values, and motivates a future figure-digitisation stage.</w:t>
+      </w:r>
+    </w:p>
+    <w:p>
+      <w:pPr>
+        <w:pStyle w:val="Heading2"/>
+      </w:pPr>
+      <w:r>
+        <w:t>5.5 Engineering findings from the pilot</w:t>
       </w:r>
     </w:p>
     <w:p>
@@ -779,7 +940,7 @@
         <w:pStyle w:val="ListBullet"/>
       </w:pPr>
       <w:r>
-        <w:t>Cost: 97k input / 21k output tokens ≈ US$1.01 for three papers (Claude Opus 5).</w:t>
+        <w:t>Constrained JSON decoding is infeasible for a 40-field nested schema (API grammar-size limit); inline-schema generation with Pydantic validation and one self-repair turn succeeded on the first attempt for all papers.</w:t>
       </w:r>
     </w:p>
     <w:p>
@@ -787,7 +948,15 @@
         <w:pStyle w:val="ListBullet"/>
       </w:pPr>
       <w:r>
-        <w:t>Constrained JSON decoding was infeasible for the full schema (grammar size limit); inline-schema generation with Pydantic validation succeeded on the first attempt for all three papers.</w:t>
+        <w:t>Review papers contribute many secondary rows; a data-origin tag is required to avoid double counting when the original papers are also extracted.</w:t>
+      </w:r>
+    </w:p>
+    <w:p>
+      <w:pPr>
+        <w:pStyle w:val="ListBullet"/>
+      </w:pPr>
+      <w:r>
+        <w:t>Extrapolating pilot cost, the 93-paper open-access corpus costs ≈US$30 and the full 1,329-paper corpus ≈US$400–500 using the Message Batches API.</w:t>
       </w:r>
     </w:p>
     <w:p>
@@ -1362,7 +1531,7 @@
           </w:tcPr>
           <w:p>
             <w:r>
-              <w:t>LLM extraction, full corpus (~1,300 papers)</w:t>
+              <w:t>LLM extraction, full corpus (~1,329 papers)</w:t>
             </w:r>
           </w:p>
         </w:tc>

</xml_diff>

<commit_message>
Correct author to Harsh Vardhan Gupta
Co-Authored-By: Claude Fable 5 <noreply@anthropic.com>
Claude-Session: https://claude.ai/code/session_018XAsB6afLZTP8oRZGAaovd
</commit_message>
<xml_diff>
--- a/FoamGPT_Research_Proposal.docx
+++ b/FoamGPT_Research_Proposal.docx
@@ -47,7 +47,7 @@
           <w:b w:val="0"/>
           <w:i w:val="0"/>
         </w:rPr>
-        <w:t>Kunal Gupta (proposer)  ·  Prof. Nikhil Gupta, FASM (faculty collaborator)</w:t>
+        <w:t>Harsh Vardhan Gupta (proposer)  ·  Prof. Nikhil Gupta, FASM (faculty collaborator)</w:t>
         <w:br/>
         <w:t>Department of Mechanical and Aerospace Engineering, NYU Tandon School of Engineering</w:t>
       </w:r>
@@ -1649,7 +1649,7 @@
         <w:pStyle w:val="ListBullet"/>
       </w:pPr>
       <w:r>
-        <w:t>Kunal Gupta: pipeline engineering, extraction and curation, benchmark design and execution, ML/LLM analysis, drafting.</w:t>
+        <w:t>Harsh Vardhan Gupta: pipeline engineering, extraction and curation, benchmark design and execution, ML/LLM analysis, drafting.</w:t>
       </w:r>
     </w:p>
     <w:p>

</xml_diff>

<commit_message>
ML baselines on full pilot (clip extrapolation), proposal updated with pilot results
Co-Authored-By: Claude Fable 5 <noreply@anthropic.com>
Claude-Session: https://claude.ai/code/session_018XAsB6afLZTP8oRZGAaovd
</commit_message>
<xml_diff>
--- a/FoamGPT_Research_Proposal.docx
+++ b/FoamGPT_Research_Proposal.docx
@@ -78,7 +78,7 @@
           <w:b w:val="0"/>
           <w:i w:val="0"/>
         </w:rPr>
-        <w:t>Syntactic foams—composites of hollow glass, ceramic, or polymer microspheres in a polymer or metal matrix—have been studied for over three decades and underpin deep-sea buoyancy modules, aerospace and marine sandwich cores, and energy-absorbing structures. We identify 1,329 research papers (1990–2026) reporting quantitative processing–structure–property (PSP) results for these materials, yet no consolidated, machine-readable dataset exists: the numbers remain locked in PDF tables and figures. As a consequence, materials selection is done by manual literature review, machine-learning models are trained on a few dozen in-house samples, and the reliability of large language models (LLMs) for composite property questions is untested. We propose FoamGPT: (i) an LLM-driven extraction pipeline that converts the syntactic-foam literature into an open, auditable PSP dataset in which every value is linked to a verbatim source quote; (ii) expert validation of the dataset by the collaborating group; and (iii) a benchmark comparing classical machine learning and frontier LLMs on property prediction, including an analysis of LLM hallucination and calibration. A working pipeline has been built and verified on a pilot: 37 records extracted from 3 papers at ≈US$1.01 with zero unit or range errors, reproducing the known density–strength relationship of aluminium syntactic foams (r = 0.97). The full open-access pilot corpus (93 papers) can be processed for approximately US$30. Outcomes are a dataset-descriptor paper and a benchmark paper, plus a data asset that enables inverse design and extension to additively manufactured composites.</w:t>
+        <w:t>Syntactic foams—composites of hollow glass, ceramic, or polymer microspheres in a polymer or metal matrix—have been studied for over three decades and underpin deep-sea buoyancy modules, aerospace and marine sandwich cores, and energy-absorbing structures. We identify 1,329 research papers (1990–2026) reporting quantitative processing–structure–property (PSP) results for these materials, yet no consolidated, machine-readable dataset exists: the numbers remain locked in PDF tables and figures. As a consequence, materials selection is done by manual literature review, machine-learning models are trained on a few dozen in-house samples, and the reliability of large language models (LLMs) for composite property questions is untested. We propose FoamGPT: (i) an LLM-driven extraction pipeline that converts the syntactic-foam literature into an open, auditable PSP dataset in which every value is linked to a verbatim source quote; (ii) expert validation of the dataset by the collaborating group; and (iii) a benchmark comparing classical machine learning and frontier LLMs on property prediction, including an analysis of LLM hallucination and calibration. The pipeline has been built and run on the full open-access pilot corpus: 93 papers processed, 80 confirmed on-topic, yielding 951 curated records (738 primary measurements) with per-value provenance; 3 papers were processed through the API at ≈US$0.75 and the remainder through validated Claude Code subagents at no marginal cost. First cross-laboratory baselines show that density is predictable from the recipe (random-forest R² = 0.79) while modulus and strength are not yet — the gap the LLM benchmark is designed to probe. Outcomes are a dataset-descriptor paper and a benchmark paper, plus a data asset that enables inverse design and extension to additively manufactured composites.</w:t>
       </w:r>
     </w:p>
     <w:p>
@@ -676,7 +676,7 @@
         <w:pStyle w:val="Heading2"/>
       </w:pPr>
       <w:r>
-        <w:t>5.2 The extraction pipeline works on real papers at low cost</w:t>
+        <w:t>5.2 The full pilot corpus has been extracted with provenance</w:t>
       </w:r>
     </w:p>
     <w:p>
@@ -685,7 +685,7 @@
           <w:b w:val="0"/>
           <w:i w:val="0"/>
         </w:rPr>
-        <w:t>A synchronous run on the three most-cited open-access papers produced 37 validated records for 97,488 input / 20,836 output tokens (≈US$1.01). Automated curation raised zero range or unit flags. Every record carries a verbatim evidence quote; spot checks confirm that values were read from the correct table rows and that unit conversions (kg/m³→g/cm³, GPa→MPa, vol%→fraction) were applied correctly.</w:t>
+        <w:t>All 93 open-access papers were processed. 80 were confirmed on-topic; the remaining 13 were keyword false positives (e.g. conservation reports using microballoon putty, an economics working paper) and were rejected by the extractor rather than yielding fabricated records. The result is 951 curated records from 80 papers: 738 primary measurements, 152 values quoted from other papers (tagged secondary, with citation) and 61 analytical/simulation values (tagged model). Every record carries a verbatim evidence quote and location; curation flagged 34 rows for expert review (mostly porosity or weight-fraction values outside physical range, i.e. likely definitional differences between papers rather than misreads).</w:t>
       </w:r>
     </w:p>
     <w:tbl>
@@ -696,14 +696,13 @@
         <w:tblLook w:firstColumn="1" w:firstRow="1" w:lastColumn="0" w:lastRow="0" w:noHBand="0" w:noVBand="1" w:val="04A0"/>
       </w:tblPr>
       <w:tblGrid>
-        <w:gridCol w:w="3120"/>
-        <w:gridCol w:w="3120"/>
-        <w:gridCol w:w="3120"/>
+        <w:gridCol w:w="4680"/>
+        <w:gridCol w:w="4680"/>
       </w:tblGrid>
       <w:tr>
         <w:tc>
           <w:tcPr>
-            <w:tcW w:type="dxa" w:w="4320"/>
+            <w:tcW w:type="dxa" w:w="4608"/>
           </w:tcPr>
           <w:p>
             <w:r/>
@@ -711,13 +710,13 @@
               <w:rPr>
                 <w:b/>
               </w:rPr>
-              <w:t>Paper</w:t>
+              <w:t>Quantity</w:t>
             </w:r>
           </w:p>
         </w:tc>
         <w:tc>
           <w:tcPr>
-            <w:tcW w:type="dxa" w:w="1152"/>
+            <w:tcW w:type="dxa" w:w="4752"/>
           </w:tcPr>
           <w:p>
             <w:r/>
@@ -725,21 +724,7 @@
               <w:rPr>
                 <w:b/>
               </w:rPr>
-              <w:t>Records</w:t>
-            </w:r>
-          </w:p>
-        </w:tc>
-        <w:tc>
-          <w:tcPr>
-            <w:tcW w:type="dxa" w:w="3888"/>
-          </w:tcPr>
-          <w:p>
-            <w:r/>
-            <w:r>
-              <w:rPr>
-                <w:b/>
-              </w:rPr>
-              <w:t>Observations</w:t>
+              <w:t>Count</w:t>
             </w:r>
           </w:p>
         </w:tc>
@@ -747,31 +732,21 @@
       <w:tr>
         <w:tc>
           <w:tcPr>
-            <w:tcW w:type="dxa" w:w="4320"/>
+            <w:tcW w:type="dxa" w:w="4608"/>
           </w:tcPr>
           <w:p>
             <w:r>
-              <w:t>Dynamic response of aluminium matrix syntactic foams subjected to high strain-rate loading (2022)</w:t>
+              <w:t>Papers processed / on-topic</w:t>
             </w:r>
           </w:p>
         </w:tc>
         <w:tc>
           <w:tcPr>
-            <w:tcW w:type="dxa" w:w="1152"/>
+            <w:tcW w:type="dxa" w:w="4752"/>
           </w:tcPr>
           <w:p>
             <w:r>
-              <w:t>12</w:t>
-            </w:r>
-          </w:p>
-        </w:tc>
-        <w:tc>
-          <w:tcPr>
-            <w:tcW w:type="dxa" w:w="3888"/>
-          </w:tcPr>
-          <w:p>
-            <w:r>
-              <w:t>Al7075 + ceramic hollow microspheres, Vf = 0.66; six quasi-static compositions (ρ 1.585–2.388 g/cm³, σ 75–181 MPa) and six SHPB tests (882–1578 s⁻¹, σ 203–601 MPa) — all traced to Tables 3–4</w:t>
+              <w:t>93 / 80</w:t>
             </w:r>
           </w:p>
         </w:tc>
@@ -779,31 +754,21 @@
       <w:tr>
         <w:tc>
           <w:tcPr>
-            <w:tcW w:type="dxa" w:w="4320"/>
+            <w:tcW w:type="dxa" w:w="4608"/>
           </w:tcPr>
           <w:p>
             <w:r>
-              <w:t>A multiscale study of damage in elastomeric syntactic foams (2018)</w:t>
+              <w:t>Curated records (primary)</w:t>
             </w:r>
           </w:p>
         </w:tc>
         <w:tc>
           <w:tcPr>
-            <w:tcW w:type="dxa" w:w="1152"/>
+            <w:tcW w:type="dxa" w:w="4752"/>
           </w:tcPr>
           <w:p>
             <w:r>
-              <w:t>5</w:t>
-            </w:r>
-          </w:p>
-        </w:tc>
-        <w:tc>
-          <w:tcPr>
-            <w:tcW w:type="dxa" w:w="3888"/>
-          </w:tcPr>
-          <w:p>
-            <w:r>
-              <w:t>Sylgard 184 PDMS + 3M A16-500 microballoons, 10–46 vol%, from Table 1</w:t>
+              <w:t>951 (738)</w:t>
             </w:r>
           </w:p>
         </w:tc>
@@ -811,31 +776,109 @@
       <w:tr>
         <w:tc>
           <w:tcPr>
-            <w:tcW w:type="dxa" w:w="4320"/>
+            <w:tcW w:type="dxa" w:w="4608"/>
           </w:tcPr>
           <w:p>
             <w:r>
-              <w:t>On the way to real applications: aluminium matrix syntactic foams (2020, review)</w:t>
+              <w:t>Records with compressive/tensile strength</w:t>
             </w:r>
           </w:p>
         </w:tc>
         <w:tc>
           <w:tcPr>
-            <w:tcW w:type="dxa" w:w="1152"/>
+            <w:tcW w:type="dxa" w:w="4752"/>
           </w:tcPr>
           <w:p>
             <w:r>
-              <w:t>20</w:t>
+              <w:t>413</w:t>
+            </w:r>
+          </w:p>
+        </w:tc>
+      </w:tr>
+      <w:tr>
+        <w:tc>
+          <w:tcPr>
+            <w:tcW w:type="dxa" w:w="4608"/>
+          </w:tcPr>
+          <w:p>
+            <w:r>
+              <w:t>Records with modulus</w:t>
             </w:r>
           </w:p>
         </w:tc>
         <w:tc>
           <w:tcPr>
-            <w:tcW w:type="dxa" w:w="3888"/>
+            <w:tcW w:type="dxa" w:w="4752"/>
           </w:tcPr>
           <w:p>
             <w:r>
-              <w:t>Literature values from the review’s Table 4 (e.g., A356/SiC, 181 MPa, Gupta et al.) — motivated the primary/secondary data-origin field to prevent double counting</w:t>
+              <w:t>314</w:t>
+            </w:r>
+          </w:p>
+        </w:tc>
+      </w:tr>
+      <w:tr>
+        <w:tc>
+          <w:tcPr>
+            <w:tcW w:type="dxa" w:w="4608"/>
+          </w:tcPr>
+          <w:p>
+            <w:r>
+              <w:t>Records with measured density</w:t>
+            </w:r>
+          </w:p>
+        </w:tc>
+        <w:tc>
+          <w:tcPr>
+            <w:tcW w:type="dxa" w:w="4752"/>
+          </w:tcPr>
+          <w:p>
+            <w:r>
+              <w:t>386</w:t>
+            </w:r>
+          </w:p>
+        </w:tc>
+      </w:tr>
+      <w:tr>
+        <w:tc>
+          <w:tcPr>
+            <w:tcW w:type="dxa" w:w="4608"/>
+          </w:tcPr>
+          <w:p>
+            <w:r>
+              <w:t>Matrix classes covered</w:t>
+            </w:r>
+          </w:p>
+        </w:tc>
+        <w:tc>
+          <w:tcPr>
+            <w:tcW w:type="dxa" w:w="4752"/>
+          </w:tcPr>
+          <w:p>
+            <w:r>
+              <w:t>epoxy (381), aluminum (229), other_thermoset (126), pp (62), vinyl_ester (50), polyurethane (43)</w:t>
+            </w:r>
+          </w:p>
+        </w:tc>
+      </w:tr>
+      <w:tr>
+        <w:tc>
+          <w:tcPr>
+            <w:tcW w:type="dxa" w:w="4608"/>
+          </w:tcPr>
+          <w:p>
+            <w:r>
+              <w:t>Test types covered</w:t>
+            </w:r>
+          </w:p>
+        </w:tc>
+        <w:tc>
+          <w:tcPr>
+            <w:tcW w:type="dxa" w:w="4752"/>
+          </w:tcPr>
+          <w:p>
+            <w:r>
+              <w:t>compression (328), tension (179), other (146), flexure (88), dma (81), impact (57)</w:t>
             </w:r>
           </w:p>
         </w:tc>
@@ -856,7 +899,7 @@
           <w:b w:val="0"/>
           <w:i w:val="0"/>
         </w:rPr>
-        <w:t>Even at pilot scale the dataset recovers established structure–property relationships. Across the 6 quasi-static aluminium-foam compositions, compressive strength rises monotonically with density (Pearson r = 0.97; 75 MPa at 1.585 g/cm³ to 181 MPa at 2.388 g/cm³), and specific strength spans 47–100 MPa·cm³/g. The same paper’s split-Hopkinson bar series shows the expected strong strain-rate sensitivity of Al7075-matrix foams, with peak stresses 2–3× the quasi-static values at ~10³ s⁻¹. These trends appear directly in the extracted table without any manual post-processing, which is the behaviour the full-scale benchmark relies on.</w:t>
+        <w:t>Figure 2 shows density against compressive modulus and strength for primary records, coloured by matrix class. The expected structure is recovered without any manual post-processing: metal-matrix foams occupy the high-density, high-strength region; polymer foams cluster at 0.3–0.9 g/cm³; and within a matrix class strength rises with density. In the aluminium subset, quasi-static strength correlates with density at r = 0.59.</w:t>
       </w:r>
     </w:p>
     <w:p>
@@ -866,7 +909,7 @@
       <w:r>
         <w:drawing>
           <wp:inline xmlns:a="http://schemas.openxmlformats.org/drawingml/2006/main" xmlns:pic="http://schemas.openxmlformats.org/drawingml/2006/picture">
-            <wp:extent cx="5303520" cy="3182112"/>
+            <wp:extent cx="5303520" cy="2024980"/>
             <wp:docPr id="2" name="Picture 2"/>
             <wp:cNvGraphicFramePr>
               <a:graphicFrameLocks noChangeAspect="1"/>
@@ -887,7 +930,7 @@
                   <pic:spPr>
                     <a:xfrm>
                       <a:off x="0" y="0"/>
-                      <a:ext cx="5303520" cy="3182112"/>
+                      <a:ext cx="5303520" cy="2024980"/>
                     </a:xfrm>
                     <a:prstGeom prst="rect"/>
                   </pic:spPr>
@@ -907,7 +950,7 @@
           <w:b w:val="0"/>
           <w:i/>
         </w:rPr>
-        <w:t>Figure 2. Density versus compressive strength for the pilot records, coloured by matrix class.</w:t>
+        <w:t>Figure 2. Density versus compressive modulus (left) and strength (right) for primary records, coloured by matrix class.</w:t>
       </w:r>
     </w:p>
     <w:p>
@@ -915,16 +958,572 @@
         <w:pStyle w:val="Heading2"/>
       </w:pPr>
       <w:r>
-        <w:t>5.4 Field coverage and what it tells us</w:t>
+        <w:t>5.4 First cross-laboratory ML baselines</w:t>
       </w:r>
     </w:p>
+    <w:tbl>
+      <w:tblPr>
+        <w:tblStyle w:val="LightGrid-Accent1"/>
+        <w:tblW w:type="auto" w:w="0"/>
+        <w:jc w:val="center"/>
+        <w:tblLook w:firstColumn="1" w:firstRow="1" w:lastColumn="0" w:lastRow="0" w:noHBand="0" w:noVBand="1" w:val="04A0"/>
+      </w:tblPr>
+      <w:tblGrid>
+        <w:gridCol w:w="1872"/>
+        <w:gridCol w:w="1872"/>
+        <w:gridCol w:w="1872"/>
+        <w:gridCol w:w="1872"/>
+        <w:gridCol w:w="1872"/>
+      </w:tblGrid>
+      <w:tr>
+        <w:tc>
+          <w:tcPr>
+            <w:tcW w:type="dxa" w:w="2304"/>
+          </w:tcPr>
+          <w:p>
+            <w:r/>
+            <w:r>
+              <w:rPr>
+                <w:b/>
+              </w:rPr>
+              <w:t>Target</w:t>
+            </w:r>
+          </w:p>
+        </w:tc>
+        <w:tc>
+          <w:tcPr>
+            <w:tcW w:type="dxa" w:w="1728"/>
+          </w:tcPr>
+          <w:p>
+            <w:r/>
+            <w:r>
+              <w:rPr>
+                <w:b/>
+              </w:rPr>
+              <w:t>Model</w:t>
+            </w:r>
+          </w:p>
+        </w:tc>
+        <w:tc>
+          <w:tcPr>
+            <w:tcW w:type="dxa" w:w="1872"/>
+          </w:tcPr>
+          <w:p>
+            <w:r/>
+            <w:r>
+              <w:rPr>
+                <w:b/>
+              </w:rPr>
+              <w:t>n rows / papers</w:t>
+            </w:r>
+          </w:p>
+        </w:tc>
+        <w:tc>
+          <w:tcPr>
+            <w:tcW w:type="dxa" w:w="1440"/>
+          </w:tcPr>
+          <w:p>
+            <w:r/>
+            <w:r>
+              <w:rPr>
+                <w:b/>
+              </w:rPr>
+              <w:t>R² (log)</w:t>
+            </w:r>
+          </w:p>
+        </w:tc>
+        <w:tc>
+          <w:tcPr>
+            <w:tcW w:type="dxa" w:w="1440"/>
+          </w:tcPr>
+          <w:p>
+            <w:r/>
+            <w:r>
+              <w:rPr>
+                <w:b/>
+              </w:rPr>
+              <w:t>MAPE %</w:t>
+            </w:r>
+          </w:p>
+        </w:tc>
+      </w:tr>
+      <w:tr>
+        <w:tc>
+          <w:tcPr>
+            <w:tcW w:type="dxa" w:w="2304"/>
+          </w:tcPr>
+          <w:p>
+            <w:r>
+              <w:t>modulus_mpa</w:t>
+            </w:r>
+          </w:p>
+        </w:tc>
+        <w:tc>
+          <w:tcPr>
+            <w:tcW w:type="dxa" w:w="1728"/>
+          </w:tcPr>
+          <w:p>
+            <w:r>
+              <w:t>ridge</w:t>
+            </w:r>
+          </w:p>
+        </w:tc>
+        <w:tc>
+          <w:tcPr>
+            <w:tcW w:type="dxa" w:w="1872"/>
+          </w:tcPr>
+          <w:p>
+            <w:r>
+              <w:t>104 / 18</w:t>
+            </w:r>
+          </w:p>
+        </w:tc>
+        <w:tc>
+          <w:tcPr>
+            <w:tcW w:type="dxa" w:w="1440"/>
+          </w:tcPr>
+          <w:p>
+            <w:r>
+              <w:t>-1.97</w:t>
+            </w:r>
+          </w:p>
+        </w:tc>
+        <w:tc>
+          <w:tcPr>
+            <w:tcW w:type="dxa" w:w="1440"/>
+          </w:tcPr>
+          <w:p>
+            <w:r>
+              <w:t>44067</w:t>
+            </w:r>
+          </w:p>
+        </w:tc>
+      </w:tr>
+      <w:tr>
+        <w:tc>
+          <w:tcPr>
+            <w:tcW w:type="dxa" w:w="2304"/>
+          </w:tcPr>
+          <w:p>
+            <w:r>
+              <w:t>modulus_mpa</w:t>
+            </w:r>
+          </w:p>
+        </w:tc>
+        <w:tc>
+          <w:tcPr>
+            <w:tcW w:type="dxa" w:w="1728"/>
+          </w:tcPr>
+          <w:p>
+            <w:r>
+              <w:t>random_forest</w:t>
+            </w:r>
+          </w:p>
+        </w:tc>
+        <w:tc>
+          <w:tcPr>
+            <w:tcW w:type="dxa" w:w="1872"/>
+          </w:tcPr>
+          <w:p>
+            <w:r>
+              <w:t>104 / 18</w:t>
+            </w:r>
+          </w:p>
+        </w:tc>
+        <w:tc>
+          <w:tcPr>
+            <w:tcW w:type="dxa" w:w="1440"/>
+          </w:tcPr>
+          <w:p>
+            <w:r>
+              <w:t>-0.92</w:t>
+            </w:r>
+          </w:p>
+        </w:tc>
+        <w:tc>
+          <w:tcPr>
+            <w:tcW w:type="dxa" w:w="1440"/>
+          </w:tcPr>
+          <w:p>
+            <w:r>
+              <w:t>6004</w:t>
+            </w:r>
+          </w:p>
+        </w:tc>
+      </w:tr>
+      <w:tr>
+        <w:tc>
+          <w:tcPr>
+            <w:tcW w:type="dxa" w:w="2304"/>
+          </w:tcPr>
+          <w:p>
+            <w:r>
+              <w:t>modulus_mpa</w:t>
+            </w:r>
+          </w:p>
+        </w:tc>
+        <w:tc>
+          <w:tcPr>
+            <w:tcW w:type="dxa" w:w="1728"/>
+          </w:tcPr>
+          <w:p>
+            <w:r>
+              <w:t>gbr</w:t>
+            </w:r>
+          </w:p>
+        </w:tc>
+        <w:tc>
+          <w:tcPr>
+            <w:tcW w:type="dxa" w:w="1872"/>
+          </w:tcPr>
+          <w:p>
+            <w:r>
+              <w:t>104 / 18</w:t>
+            </w:r>
+          </w:p>
+        </w:tc>
+        <w:tc>
+          <w:tcPr>
+            <w:tcW w:type="dxa" w:w="1440"/>
+          </w:tcPr>
+          <w:p>
+            <w:r>
+              <w:t>-0.89</w:t>
+            </w:r>
+          </w:p>
+        </w:tc>
+        <w:tc>
+          <w:tcPr>
+            <w:tcW w:type="dxa" w:w="1440"/>
+          </w:tcPr>
+          <w:p>
+            <w:r>
+              <w:t>6218</w:t>
+            </w:r>
+          </w:p>
+        </w:tc>
+      </w:tr>
+      <w:tr>
+        <w:tc>
+          <w:tcPr>
+            <w:tcW w:type="dxa" w:w="2304"/>
+          </w:tcPr>
+          <w:p>
+            <w:r>
+              <w:t>strength_mpa</w:t>
+            </w:r>
+          </w:p>
+        </w:tc>
+        <w:tc>
+          <w:tcPr>
+            <w:tcW w:type="dxa" w:w="1728"/>
+          </w:tcPr>
+          <w:p>
+            <w:r>
+              <w:t>ridge</w:t>
+            </w:r>
+          </w:p>
+        </w:tc>
+        <w:tc>
+          <w:tcPr>
+            <w:tcW w:type="dxa" w:w="1872"/>
+          </w:tcPr>
+          <w:p>
+            <w:r>
+              <w:t>152 / 25</w:t>
+            </w:r>
+          </w:p>
+        </w:tc>
+        <w:tc>
+          <w:tcPr>
+            <w:tcW w:type="dxa" w:w="1440"/>
+          </w:tcPr>
+          <w:p>
+            <w:r>
+              <w:t>-2.45</w:t>
+            </w:r>
+          </w:p>
+        </w:tc>
+        <w:tc>
+          <w:tcPr>
+            <w:tcW w:type="dxa" w:w="1440"/>
+          </w:tcPr>
+          <w:p>
+            <w:r>
+              <w:t>686</w:t>
+            </w:r>
+          </w:p>
+        </w:tc>
+      </w:tr>
+      <w:tr>
+        <w:tc>
+          <w:tcPr>
+            <w:tcW w:type="dxa" w:w="2304"/>
+          </w:tcPr>
+          <w:p>
+            <w:r>
+              <w:t>strength_mpa</w:t>
+            </w:r>
+          </w:p>
+        </w:tc>
+        <w:tc>
+          <w:tcPr>
+            <w:tcW w:type="dxa" w:w="1728"/>
+          </w:tcPr>
+          <w:p>
+            <w:r>
+              <w:t>random_forest</w:t>
+            </w:r>
+          </w:p>
+        </w:tc>
+        <w:tc>
+          <w:tcPr>
+            <w:tcW w:type="dxa" w:w="1872"/>
+          </w:tcPr>
+          <w:p>
+            <w:r>
+              <w:t>152 / 25</w:t>
+            </w:r>
+          </w:p>
+        </w:tc>
+        <w:tc>
+          <w:tcPr>
+            <w:tcW w:type="dxa" w:w="1440"/>
+          </w:tcPr>
+          <w:p>
+            <w:r>
+              <w:t>-0.17</w:t>
+            </w:r>
+          </w:p>
+        </w:tc>
+        <w:tc>
+          <w:tcPr>
+            <w:tcW w:type="dxa" w:w="1440"/>
+          </w:tcPr>
+          <w:p>
+            <w:r>
+              <w:t>142</w:t>
+            </w:r>
+          </w:p>
+        </w:tc>
+      </w:tr>
+      <w:tr>
+        <w:tc>
+          <w:tcPr>
+            <w:tcW w:type="dxa" w:w="2304"/>
+          </w:tcPr>
+          <w:p>
+            <w:r>
+              <w:t>strength_mpa</w:t>
+            </w:r>
+          </w:p>
+        </w:tc>
+        <w:tc>
+          <w:tcPr>
+            <w:tcW w:type="dxa" w:w="1728"/>
+          </w:tcPr>
+          <w:p>
+            <w:r>
+              <w:t>gbr</w:t>
+            </w:r>
+          </w:p>
+        </w:tc>
+        <w:tc>
+          <w:tcPr>
+            <w:tcW w:type="dxa" w:w="1872"/>
+          </w:tcPr>
+          <w:p>
+            <w:r>
+              <w:t>152 / 25</w:t>
+            </w:r>
+          </w:p>
+        </w:tc>
+        <w:tc>
+          <w:tcPr>
+            <w:tcW w:type="dxa" w:w="1440"/>
+          </w:tcPr>
+          <w:p>
+            <w:r>
+              <w:t>-0.16</w:t>
+            </w:r>
+          </w:p>
+        </w:tc>
+        <w:tc>
+          <w:tcPr>
+            <w:tcW w:type="dxa" w:w="1440"/>
+          </w:tcPr>
+          <w:p>
+            <w:r>
+              <w:t>133</w:t>
+            </w:r>
+          </w:p>
+        </w:tc>
+      </w:tr>
+      <w:tr>
+        <w:tc>
+          <w:tcPr>
+            <w:tcW w:type="dxa" w:w="2304"/>
+          </w:tcPr>
+          <w:p>
+            <w:r>
+              <w:t>measured_density_g_cc</w:t>
+            </w:r>
+          </w:p>
+        </w:tc>
+        <w:tc>
+          <w:tcPr>
+            <w:tcW w:type="dxa" w:w="1728"/>
+          </w:tcPr>
+          <w:p>
+            <w:r>
+              <w:t>ridge</w:t>
+            </w:r>
+          </w:p>
+        </w:tc>
+        <w:tc>
+          <w:tcPr>
+            <w:tcW w:type="dxa" w:w="1872"/>
+          </w:tcPr>
+          <w:p>
+            <w:r>
+              <w:t>271 / 40</w:t>
+            </w:r>
+          </w:p>
+        </w:tc>
+        <w:tc>
+          <w:tcPr>
+            <w:tcW w:type="dxa" w:w="1440"/>
+          </w:tcPr>
+          <w:p>
+            <w:r>
+              <w:t>0.19</w:t>
+            </w:r>
+          </w:p>
+        </w:tc>
+        <w:tc>
+          <w:tcPr>
+            <w:tcW w:type="dxa" w:w="1440"/>
+          </w:tcPr>
+          <w:p>
+            <w:r>
+              <w:t>36</w:t>
+            </w:r>
+          </w:p>
+        </w:tc>
+      </w:tr>
+      <w:tr>
+        <w:tc>
+          <w:tcPr>
+            <w:tcW w:type="dxa" w:w="2304"/>
+          </w:tcPr>
+          <w:p>
+            <w:r>
+              <w:t>measured_density_g_cc</w:t>
+            </w:r>
+          </w:p>
+        </w:tc>
+        <w:tc>
+          <w:tcPr>
+            <w:tcW w:type="dxa" w:w="1728"/>
+          </w:tcPr>
+          <w:p>
+            <w:r>
+              <w:t>random_forest</w:t>
+            </w:r>
+          </w:p>
+        </w:tc>
+        <w:tc>
+          <w:tcPr>
+            <w:tcW w:type="dxa" w:w="1872"/>
+          </w:tcPr>
+          <w:p>
+            <w:r>
+              <w:t>271 / 40</w:t>
+            </w:r>
+          </w:p>
+        </w:tc>
+        <w:tc>
+          <w:tcPr>
+            <w:tcW w:type="dxa" w:w="1440"/>
+          </w:tcPr>
+          <w:p>
+            <w:r>
+              <w:t>0.79</w:t>
+            </w:r>
+          </w:p>
+        </w:tc>
+        <w:tc>
+          <w:tcPr>
+            <w:tcW w:type="dxa" w:w="1440"/>
+          </w:tcPr>
+          <w:p>
+            <w:r>
+              <w:t>20</w:t>
+            </w:r>
+          </w:p>
+        </w:tc>
+      </w:tr>
+      <w:tr>
+        <w:tc>
+          <w:tcPr>
+            <w:tcW w:type="dxa" w:w="2304"/>
+          </w:tcPr>
+          <w:p>
+            <w:r>
+              <w:t>measured_density_g_cc</w:t>
+            </w:r>
+          </w:p>
+        </w:tc>
+        <w:tc>
+          <w:tcPr>
+            <w:tcW w:type="dxa" w:w="1728"/>
+          </w:tcPr>
+          <w:p>
+            <w:r>
+              <w:t>gbr</w:t>
+            </w:r>
+          </w:p>
+        </w:tc>
+        <w:tc>
+          <w:tcPr>
+            <w:tcW w:type="dxa" w:w="1872"/>
+          </w:tcPr>
+          <w:p>
+            <w:r>
+              <w:t>271 / 40</w:t>
+            </w:r>
+          </w:p>
+        </w:tc>
+        <w:tc>
+          <w:tcPr>
+            <w:tcW w:type="dxa" w:w="1440"/>
+          </w:tcPr>
+          <w:p>
+            <w:r>
+              <w:t>0.75</w:t>
+            </w:r>
+          </w:p>
+        </w:tc>
+        <w:tc>
+          <w:tcPr>
+            <w:tcW w:type="dxa" w:w="1440"/>
+          </w:tcPr>
+          <w:p>
+            <w:r>
+              <w:t>22</w:t>
+            </w:r>
+          </w:p>
+        </w:tc>
+      </w:tr>
+    </w:tbl>
+    <w:p/>
     <w:p>
       <w:r>
         <w:rPr>
           <w:b w:val="0"/>
           <w:i w:val="0"/>
         </w:rPr>
-        <w:t>Coverage across the 37 pilot records is 84% for strength, 32% for modulus, 22% for measured density, 38% for volume fraction and 46% for strain rate. Gaps are genuine (values not stated in tables) rather than extraction failures—the model left fields null instead of guessing, as instructed. This supports the design decision to score the dataset by provenance and completeness rather than force-fill values, and motivates a future figure-digitisation stage.</w:t>
+        <w:t>With whole papers held out (GroupKFold), density is already predictable from processing descriptors alone (random forest R² ≈ 0.79, MAPE ≈ 20%), confirming the dataset carries real signal. Modulus and strength are not yet predictable across laboratories at this size (negative R²): the rows span metal and polymer matrices, quasi-static and split-Hopkinson tests, and heterogeneous particle grades, and many papers report only one or two conditions. This is the central empirical finding of the pilot — recipe-level features alone do not transfer between labs — and it sets the bar for the LLM benchmark: can a model with literature knowledge and retrieval over this dataset do better than a tree ensemble that has never seen the paper?</w:t>
       </w:r>
     </w:p>
     <w:p>
@@ -932,7 +1531,47 @@
         <w:pStyle w:val="Heading2"/>
       </w:pPr>
       <w:r>
-        <w:t>5.5 Engineering findings from the pilot</w:t>
+        <w:t>5.5 Data-availability findings</w:t>
+      </w:r>
+    </w:p>
+    <w:p>
+      <w:pPr>
+        <w:pStyle w:val="ListBullet"/>
+      </w:pPr>
+      <w:r>
+        <w:t>A large share of on-topic papers, especially before 2010, report results only in figures; those records carry composition and test conditions with null properties. The pipeline records this honestly rather than reading values off plots, which quantifies the case for a figure-digitisation stage.</w:t>
+      </w:r>
+    </w:p>
+    <w:p>
+      <w:pPr>
+        <w:pStyle w:val="ListBullet"/>
+      </w:pPr>
+      <w:r>
+        <w:t>Theses are the richest single sources (one 236-page thesis yielded 185 records) but require full-document parsing; an early 40-page cap silently truncated ten of them and was removed.</w:t>
+      </w:r>
+    </w:p>
+    <w:p>
+      <w:pPr>
+        <w:pStyle w:val="ListBullet"/>
+      </w:pPr>
+      <w:r>
+        <w:t>Review papers contribute many secondary rows; the data-origin tag is essential to keep them out of the training set while preserving them for cross-referencing.</w:t>
+      </w:r>
+    </w:p>
+    <w:p>
+      <w:pPr>
+        <w:pStyle w:val="ListBullet"/>
+      </w:pPr>
+      <w:r>
+        <w:t>Several papers contain internal inconsistencies (table vs. text values, unit labels contradicting magnitudes); the extractor records the conflict in notes and lowers confidence, giving the expert audit a targeted list.</w:t>
+      </w:r>
+    </w:p>
+    <w:p>
+      <w:pPr>
+        <w:pStyle w:val="Heading2"/>
+      </w:pPr>
+      <w:r>
+        <w:t>5.6 Engineering findings from the pilot</w:t>
       </w:r>
     </w:p>
     <w:p>
@@ -956,7 +1595,7 @@
         <w:pStyle w:val="ListBullet"/>
       </w:pPr>
       <w:r>
-        <w:t>Extrapolating pilot cost, the 93-paper open-access corpus costs ≈US$30 and the full 1,329-paper corpus ≈US$400–500 using the Message Batches API.</w:t>
+        <w:t>API cost for the 3-paper sync run was ≈US$0.75; extrapolated, the full 1,329-paper corpus costs ≈US$400–500 via the Message Batches API, or can be processed through the validated Claude Code agent lane at no marginal API cost.</w:t>
       </w:r>
     </w:p>
     <w:p>
@@ -1045,7 +1684,7 @@
           </w:tcPr>
           <w:p>
             <w:r>
-              <w:t>1. Pilot corpus</w:t>
+              <w:t>1. Pilot corpus (done)</w:t>
             </w:r>
           </w:p>
         </w:tc>
@@ -1055,7 +1694,7 @@
           </w:tcPr>
           <w:p>
             <w:r>
-              <w:t>1–2</w:t>
+              <w:t>—</w:t>
             </w:r>
           </w:p>
         </w:tc>
@@ -1065,7 +1704,7 @@
           </w:tcPr>
           <w:p>
             <w:r>
-              <w:t>Batch-extract 93 OA papers; curate; first descriptive statistics and density–property maps</w:t>
+              <w:t>93 OA papers extracted; curated; density–property maps; first ML baselines</w:t>
             </w:r>
           </w:p>
         </w:tc>

</xml_diff>